<commit_message>
Audit: add robustness checks, gasoline parity table, correct sensitivity figures
Co-authored-by: M-osss <M-osss@users.noreply.github.com>
</commit_message>
<xml_diff>
--- a/output/Paper_B_Solutions_SID_20987955.docx
+++ b/output/Paper_B_Solutions_SID_20987955.docx
@@ -2039,7 +2039,116 @@
         <w:rPr>
           <w:color w:val="1F3A68"/>
         </w:rPr>
-        <w:t>1.7  Summary of Q1 results</w:t>
+        <w:t>1.7  Robustness checks (subtleties verified)</w:t>
+      </w:r>
+    </w:p>
+    <w:p>
+      <w:pPr>
+        <w:pStyle w:val="ListBullet"/>
+      </w:pPr>
+      <w:r>
+        <w:rPr>
+          <w:b/>
+        </w:rPr>
+        <w:t xml:space="preserve">MACRS disposal accounting: </w:t>
+      </w:r>
+      <w:r>
+        <w:t>Textbook convention used: Y1–Y5 take full rates 20/32/19.20/11.52/11.52 % (Σ = 94.24 %) and the un-recovered 5.76 % becomes a disposal loss in Y5. Under the strict IRS half-year-of-disposal rule, Y5 depreciation would instead be 5.76 % and the disposal loss 11.52 %. In both treatments the Y5 total deductible amount is identical (5.76 % + 5.76 % = 11.52 % = USD 4.608 M), so Y5 tax = USD 4.514 M and Y5 cash flow = USD 52.487 M either way. NPV and IRR are therefore invariant to which MACRS-disposal convention is used.</w:t>
+      </w:r>
+    </w:p>
+    <w:p>
+      <w:pPr>
+        <w:pStyle w:val="ListBullet"/>
+      </w:pPr>
+      <w:r>
+        <w:rPr>
+          <w:b/>
+        </w:rPr>
+        <w:t xml:space="preserve">Tax treatment of the development cost X: </w:t>
+      </w:r>
+      <w:r>
+        <w:t>I capitalised X as a non-depreciable, non-deductible pre-operating outlay (conservative). If instead X is expensed in Year 0 against parent-company taxable income, an immediate tax shield of 0.15 × X = USD 3,148,193 is added to Y0. NPV(20 %) then rises to ≈ USD 28.0 M and DCFROR to ≈ 34.5 %.</w:t>
+      </w:r>
+    </w:p>
+    <w:p>
+      <w:pPr>
+        <w:pStyle w:val="ListBullet"/>
+      </w:pPr>
+      <w:r>
+        <w:rPr>
+          <w:b/>
+        </w:rPr>
+        <w:t xml:space="preserve">Timing convention for pre-operating cash outlays: </w:t>
+      </w:r>
+      <w:r>
+        <w:t>I lumped X, equipment and working capital at Year 0 (operations Y1–Y5) — the standard textbook treatment used in most plant-economics courses. Two alternatives were tested: (i) A pure 1-year time-shift of the whole cash-flow stream (entire profile pushed back by the development year). Mathematically this divides NPV by (1+r) but leaves the IRR root unchanged: NPV(20 %) ≈ USD 20.7 M, DCFROR ≈ 32.5 %. (ii) Separating the outlays — X at Y0, equipment + WC (USD 60 M) at Y1, operating cash flows at Y2–Y6 — which postpones the bulk of capex by one year but also postpones revenue: NPV(20 %) ≈ USD 17.2 M, DCFROR ≈ 28.9 %. In every case NPV is positive and DCFROR exceeds the 20 % hurdle, so the accept-the-project conclusion is robust to the timing assumption.</w:t>
+      </w:r>
+    </w:p>
+    <w:p>
+      <w:pPr>
+        <w:pStyle w:val="ListBullet"/>
+      </w:pPr>
+      <w:r>
+        <w:rPr>
+          <w:b/>
+        </w:rPr>
+        <w:t xml:space="preserve">Production = sales: </w:t>
+      </w:r>
+      <w:r>
+        <w:t>Variable cost is given per unit "produced". Assumed no inventory build-up, so production = sales = 500,000 units / yr.</w:t>
+      </w:r>
+    </w:p>
+    <w:p>
+      <w:pPr>
+        <w:pStyle w:val="ListBullet"/>
+      </w:pPr>
+      <w:r>
+        <w:rPr>
+          <w:b/>
+        </w:rPr>
+        <w:t xml:space="preserve">Advertising deductibility: </w:t>
+      </w:r>
+      <w:r>
+        <w:t>Treated as an annual tax-deductible operating expense (standard for HK profits tax).</w:t>
+      </w:r>
+    </w:p>
+    <w:p>
+      <w:pPr>
+        <w:pStyle w:val="ListBullet"/>
+      </w:pPr>
+      <w:r>
+        <w:rPr>
+          <w:b/>
+        </w:rPr>
+        <w:t xml:space="preserve">Working capital: </w:t>
+      </w:r>
+      <w:r>
+        <w:t>Single injection at start-up, fully recovered at end of Year 5 (no tax effect on recovery).</w:t>
+      </w:r>
+    </w:p>
+    <w:p>
+      <w:pPr>
+        <w:pStyle w:val="ListBullet"/>
+      </w:pPr>
+      <w:r>
+        <w:rPr>
+          <w:b/>
+        </w:rPr>
+        <w:t xml:space="preserve">Discount-rate / convention: </w:t>
+      </w:r>
+      <w:r>
+        <w:t>End-of-year cash flow convention at i = 20 % p.a., consistent with the discrete annual cash-flow table.</w:t>
+      </w:r>
+    </w:p>
+    <w:p>
+      <w:pPr>
+        <w:pStyle w:val="Heading2"/>
+      </w:pPr>
+      <w:r>
+        <w:rPr>
+          <w:color w:val="1F3A68"/>
+        </w:rPr>
+        <w:t>1.8  Summary of Q1 results</w:t>
       </w:r>
     </w:p>
     <w:tbl>
@@ -3275,7 +3384,158 @@
         <w:rPr>
           <w:color w:val="1F3A68"/>
         </w:rPr>
-        <w:t>A5. Benchmark and conclusion</w:t>
+        <w:t>A5. Parity with gasoline on the three stated criteria</w:t>
+      </w:r>
+    </w:p>
+    <w:tbl>
+      <w:tblPr>
+        <w:tblStyle w:val="LightGrid-Accent1"/>
+        <w:tblW w:type="auto" w:w="0"/>
+        <w:tblLook w:firstColumn="1" w:firstRow="1" w:lastColumn="0" w:lastRow="0" w:noHBand="0" w:noVBand="1" w:val="04A0"/>
+      </w:tblPr>
+      <w:tblGrid>
+        <w:gridCol w:w="3324"/>
+        <w:gridCol w:w="3324"/>
+        <w:gridCol w:w="3324"/>
+      </w:tblGrid>
+      <w:tr>
+        <w:tc>
+          <w:tcPr>
+            <w:tcW w:type="dxa" w:w="3324"/>
+          </w:tcPr>
+          <w:p>
+            <w:r>
+              <w:t>Criterion</w:t>
+            </w:r>
+          </w:p>
+        </w:tc>
+        <w:tc>
+          <w:tcPr>
+            <w:tcW w:type="dxa" w:w="3324"/>
+          </w:tcPr>
+          <w:p>
+            <w:r>
+              <w:t>Gasoline reference</w:t>
+            </w:r>
+          </w:p>
+        </w:tc>
+        <w:tc>
+          <w:tcPr>
+            <w:tcW w:type="dxa" w:w="3324"/>
+          </w:tcPr>
+          <w:p>
+            <w:r>
+              <w:t>This H₂ facility</w:t>
+            </w:r>
+          </w:p>
+        </w:tc>
+      </w:tr>
+      <w:tr>
+        <w:tc>
+          <w:tcPr>
+            <w:tcW w:type="dxa" w:w="3324"/>
+          </w:tcPr>
+          <w:p>
+            <w:r>
+              <w:t>Cost per 100 km of service</w:t>
+            </w:r>
+          </w:p>
+        </w:tc>
+        <w:tc>
+          <w:tcPr>
+            <w:tcW w:type="dxa" w:w="3324"/>
+          </w:tcPr>
+          <w:p>
+            <w:r>
+              <w:t>7 L gasoline × HK$25/L ≈ USD 22 / 100 km</w:t>
+            </w:r>
+          </w:p>
+        </w:tc>
+        <w:tc>
+          <w:tcPr>
+            <w:tcW w:type="dxa" w:w="3324"/>
+          </w:tcPr>
+          <w:p>
+            <w:r>
+              <w:t>≈ 1 kg H₂ × LCOH = USD 18–31 / 100 km (USD 14–18 with cluster procurement)</w:t>
+            </w:r>
+          </w:p>
+        </w:tc>
+      </w:tr>
+      <w:tr>
+        <w:tc>
+          <w:tcPr>
+            <w:tcW w:type="dxa" w:w="3324"/>
+          </w:tcPr>
+          <w:p>
+            <w:r>
+              <w:t>Refuelling time (5 kg fill)</w:t>
+            </w:r>
+          </w:p>
+        </w:tc>
+        <w:tc>
+          <w:tcPr>
+            <w:tcW w:type="dxa" w:w="3324"/>
+          </w:tcPr>
+          <w:p>
+            <w:r>
+              <w:t>≈ 3–5 min</w:t>
+            </w:r>
+          </w:p>
+        </w:tc>
+        <w:tc>
+          <w:tcPr>
+            <w:tcW w:type="dxa" w:w="3324"/>
+          </w:tcPr>
+          <w:p>
+            <w:r>
+              <w:t>≈ 3–5 min via H70 fast-fill (–40 °C pre-cooled cascade), bounded by SAE J2601 protocol</w:t>
+            </w:r>
+          </w:p>
+        </w:tc>
+      </w:tr>
+      <w:tr>
+        <w:tc>
+          <w:tcPr>
+            <w:tcW w:type="dxa" w:w="3324"/>
+          </w:tcPr>
+          <w:p>
+            <w:r>
+              <w:t>User convenience</w:t>
+            </w:r>
+          </w:p>
+        </w:tc>
+        <w:tc>
+          <w:tcPr>
+            <w:tcW w:type="dxa" w:w="3324"/>
+          </w:tcPr>
+          <w:p>
+            <w:r>
+              <w:t>Self-service nozzle, card payment, ~24 / 7 access</w:t>
+            </w:r>
+          </w:p>
+        </w:tc>
+        <w:tc>
+          <w:tcPr>
+            <w:tcW w:type="dxa" w:w="3324"/>
+          </w:tcPr>
+          <w:p>
+            <w:r>
+              <w:t>Self-service H70 nozzle with break-away coupling, RFID + Octopus / app payment, geofenced 24/7 access, identical UX</w:t>
+            </w:r>
+          </w:p>
+        </w:tc>
+      </w:tr>
+    </w:tbl>
+    <w:p>
+      <w:pPr>
+        <w:pStyle w:val="Heading3"/>
+      </w:pPr>
+      <w:r>
+        <w:rPr>
+          <w:color w:val="1F3A68"/>
+        </w:rPr>
+        <w:t>A6. Benchmark and conclusion</w:t>
       </w:r>
     </w:p>
     <w:p>

</xml_diff>